<commit_message>
Title, acronym, and team names updated
</commit_message>
<xml_diff>
--- a/Project Proposal.docx
+++ b/Project Proposal.docx
@@ -23,7 +23,10 @@
         <w:jc w:val="center"/>
       </w:pPr>
       <w:r>
-        <w:t>Acronym</w:t>
+        <w:t>AgenticDerm</w:t>
+      </w:r>
+      <w:r>
+        <w:t>a</w:t>
       </w:r>
     </w:p>
     <w:p>
@@ -35,7 +38,7 @@
           <w:b/>
           <w:sz w:val="34"/>
         </w:rPr>
-        <w:t>Title</w:t>
+        <w:t>Multi-Agent Deep Learning for Dermatological Image Classification and Explainability</w:t>
       </w:r>
     </w:p>
     <w:p/>
@@ -2164,7 +2167,7 @@
                 <w:b/>
                 <w:sz w:val="18"/>
               </w:rPr>
-              <w:t>…………………</w:t>
+              <w:t>Emanuele DAMIANO</w:t>
             </w:r>
           </w:p>
         </w:tc>
@@ -2241,7 +2244,7 @@
                 <w:b/>
                 <w:sz w:val="18"/>
               </w:rPr>
-              <w:t>…………………</w:t>
+              <w:t>Flavia FORTE</w:t>
             </w:r>
           </w:p>
         </w:tc>
@@ -2319,7 +2322,7 @@
                 <w:b/>
                 <w:sz w:val="18"/>
               </w:rPr>
-              <w:t>…………………</w:t>
+              <w:t>Abdelkader MESSLEM</w:t>
             </w:r>
           </w:p>
         </w:tc>
@@ -4071,23 +4074,7 @@
         <w:jc w:val="both"/>
       </w:pPr>
       <w:r>
-        <w:t xml:space="preserve">Each work package produces a deliverable with a defined verification check. </w:t>
-      </w:r>
-      <w:proofErr w:type="gramStart"/>
-      <w:r>
-        <w:t>Outputs become</w:t>
-      </w:r>
-      <w:proofErr w:type="gramEnd"/>
-      <w:r>
-        <w:t xml:space="preserve"> </w:t>
-      </w:r>
-      <w:proofErr w:type="gramStart"/>
-      <w:r>
-        <w:t>inputs</w:t>
-      </w:r>
-      <w:proofErr w:type="gramEnd"/>
-      <w:r>
-        <w:t xml:space="preserve"> to later work packages only after acceptance.</w:t>
+        <w:t>Each work package produces a deliverable with a defined verification check. Outputs become inputs to later work packages only after acceptance.</w:t>
       </w:r>
     </w:p>
     <w:p>

</xml_diff>